<commit_message>
Fix heading styles so Google Docs shows document outline
H1/H2/H3/H4 helpers now use doc.add_heading(level=N) which assigns
the built-in Word 'Heading 1/2/3/4' styles. Google Docs only populates
the outline sidebar when paragraphs use these built-in styles — plain
bold paragraphs are invisible to the outline engine.

Result: 6 x Heading 1 (Tab sections), 34 x Heading 2,
46 x Heading 3, 19 x Heading 4 — all visible in Google Docs outline.

Co-authored-by: Wecsley Prates <wecsley.prates@joinworth.com>
</commit_message>
<xml_diff>
--- a/AI-Powered-NAICS-Industry-Classification-Agent/modeling/Industry_Classification_Worthopedia.docx
+++ b/AI-Powered-NAICS-Industry-Classification-Agent/modeling/Industry_Classification_Worthopedia.docx
@@ -51,6 +51,7 @@
     </w:p>
     <w:p>
       <w:pPr>
+        <w:pStyle w:val="Heading2"/>
         <w:keepNext/>
         <w:spacing w:before="280" w:after="100"/>
       </w:pPr>
@@ -558,6 +559,7 @@
     </w:p>
     <w:p>
       <w:pPr>
+        <w:pStyle w:val="Heading1"/>
         <w:keepNext/>
         <w:spacing w:before="320" w:after="120"/>
       </w:pPr>
@@ -627,6 +629,7 @@
     </w:p>
     <w:p>
       <w:pPr>
+        <w:pStyle w:val="Heading2"/>
         <w:keepNext/>
         <w:spacing w:before="280" w:after="100"/>
       </w:pPr>
@@ -1117,6 +1120,7 @@
     </w:p>
     <w:p>
       <w:pPr>
+        <w:pStyle w:val="Heading2"/>
         <w:keepNext/>
         <w:spacing w:before="280" w:after="100"/>
       </w:pPr>
@@ -1605,6 +1609,7 @@
     </w:p>
     <w:p>
       <w:pPr>
+        <w:pStyle w:val="Heading2"/>
         <w:keepNext/>
         <w:spacing w:before="280" w:after="100"/>
       </w:pPr>
@@ -2252,6 +2257,7 @@
     </w:p>
     <w:p>
       <w:pPr>
+        <w:pStyle w:val="Heading2"/>
         <w:keepNext/>
         <w:spacing w:before="280" w:after="100"/>
       </w:pPr>
@@ -3217,6 +3223,7 @@
     </w:p>
     <w:p>
       <w:pPr>
+        <w:pStyle w:val="Heading1"/>
         <w:keepNext/>
         <w:spacing w:before="320" w:after="120"/>
       </w:pPr>
@@ -3283,6 +3290,7 @@
     </w:p>
     <w:p>
       <w:pPr>
+        <w:pStyle w:val="Heading2"/>
         <w:keepNext/>
         <w:spacing w:before="280" w:after="100"/>
       </w:pPr>
@@ -3581,6 +3589,7 @@
     </w:p>
     <w:p>
       <w:pPr>
+        <w:pStyle w:val="Heading2"/>
         <w:keepNext/>
         <w:spacing w:before="280" w:after="100"/>
       </w:pPr>
@@ -3608,6 +3617,7 @@
     </w:p>
     <w:p>
       <w:pPr>
+        <w:pStyle w:val="Heading3"/>
         <w:keepNext/>
         <w:spacing w:before="200" w:after="60"/>
       </w:pPr>
@@ -4226,6 +4236,7 @@
     </w:p>
     <w:p>
       <w:pPr>
+        <w:pStyle w:val="Heading2"/>
         <w:keepNext/>
         <w:spacing w:before="280" w:after="100"/>
       </w:pPr>
@@ -4292,6 +4303,7 @@
     </w:p>
     <w:p>
       <w:pPr>
+        <w:pStyle w:val="Heading3"/>
         <w:keepNext/>
         <w:spacing w:before="200" w:after="60"/>
       </w:pPr>
@@ -4564,6 +4576,7 @@
     </w:p>
     <w:p>
       <w:pPr>
+        <w:pStyle w:val="Heading3"/>
         <w:keepNext/>
         <w:spacing w:before="200" w:after="60"/>
       </w:pPr>
@@ -4693,6 +4706,7 @@
     </w:p>
     <w:p>
       <w:pPr>
+        <w:pStyle w:val="Heading2"/>
         <w:keepNext/>
         <w:spacing w:before="280" w:after="100"/>
       </w:pPr>
@@ -4988,6 +5002,7 @@
     </w:p>
     <w:p>
       <w:pPr>
+        <w:pStyle w:val="Heading2"/>
         <w:keepNext/>
         <w:spacing w:before="280" w:after="100"/>
       </w:pPr>
@@ -5231,6 +5246,7 @@
     </w:p>
     <w:p>
       <w:pPr>
+        <w:pStyle w:val="Heading2"/>
         <w:keepNext/>
         <w:spacing w:before="280" w:after="100"/>
       </w:pPr>
@@ -5441,6 +5457,7 @@
     </w:p>
     <w:p>
       <w:pPr>
+        <w:pStyle w:val="Heading2"/>
         <w:keepNext/>
         <w:spacing w:before="280" w:after="100"/>
       </w:pPr>
@@ -5892,6 +5909,7 @@
     </w:p>
     <w:p>
       <w:pPr>
+        <w:pStyle w:val="Heading2"/>
         <w:keepNext/>
         <w:spacing w:before="280" w:after="100"/>
       </w:pPr>
@@ -6250,6 +6268,7 @@
     </w:p>
     <w:p>
       <w:pPr>
+        <w:pStyle w:val="Heading1"/>
         <w:keepNext/>
         <w:spacing w:before="320" w:after="120"/>
       </w:pPr>
@@ -6264,6 +6283,7 @@
     </w:p>
     <w:p>
       <w:pPr>
+        <w:pStyle w:val="Heading2"/>
         <w:keepNext/>
         <w:spacing w:before="280" w:after="100"/>
       </w:pPr>
@@ -6957,6 +6977,7 @@
     </w:p>
     <w:p>
       <w:pPr>
+        <w:pStyle w:val="Heading2"/>
         <w:keepNext/>
         <w:spacing w:before="280" w:after="100"/>
       </w:pPr>
@@ -7469,6 +7490,7 @@
     </w:p>
     <w:p>
       <w:pPr>
+        <w:pStyle w:val="Heading2"/>
         <w:keepNext/>
         <w:spacing w:before="280" w:after="100"/>
       </w:pPr>
@@ -8061,6 +8083,7 @@
     </w:p>
     <w:p>
       <w:pPr>
+        <w:pStyle w:val="Heading1"/>
         <w:keepNext/>
         <w:spacing w:before="320" w:after="120"/>
       </w:pPr>
@@ -8075,6 +8098,7 @@
     </w:p>
     <w:p>
       <w:pPr>
+        <w:pStyle w:val="Heading2"/>
         <w:keepNext/>
         <w:spacing w:before="280" w:after="100"/>
       </w:pPr>
@@ -8919,6 +8943,7 @@
     </w:p>
     <w:p>
       <w:pPr>
+        <w:pStyle w:val="Heading2"/>
         <w:keepNext/>
         <w:spacing w:before="280" w:after="100"/>
       </w:pPr>
@@ -8933,6 +8958,7 @@
     </w:p>
     <w:p>
       <w:pPr>
+        <w:pStyle w:val="Heading3"/>
         <w:keepNext/>
         <w:spacing w:before="200" w:after="60"/>
       </w:pPr>
@@ -9100,6 +9126,7 @@
     </w:p>
     <w:p>
       <w:pPr>
+        <w:pStyle w:val="Heading3"/>
         <w:keepNext/>
         <w:spacing w:before="200" w:after="60"/>
       </w:pPr>
@@ -9602,6 +9629,7 @@
     </w:p>
     <w:p>
       <w:pPr>
+        <w:pStyle w:val="Heading3"/>
         <w:keepNext/>
         <w:spacing w:before="200" w:after="60"/>
       </w:pPr>
@@ -9809,6 +9837,7 @@
     </w:p>
     <w:p>
       <w:pPr>
+        <w:pStyle w:val="Heading3"/>
         <w:keepNext/>
         <w:spacing w:before="200" w:after="60"/>
       </w:pPr>
@@ -10040,6 +10069,7 @@
     </w:p>
     <w:p>
       <w:pPr>
+        <w:pStyle w:val="Heading2"/>
         <w:keepNext/>
         <w:spacing w:before="280" w:after="100"/>
       </w:pPr>
@@ -10054,6 +10084,7 @@
     </w:p>
     <w:p>
       <w:pPr>
+        <w:pStyle w:val="Heading3"/>
         <w:keepNext/>
         <w:spacing w:before="200" w:after="60"/>
       </w:pPr>
@@ -10298,6 +10329,7 @@
     </w:p>
     <w:p>
       <w:pPr>
+        <w:pStyle w:val="Heading3"/>
         <w:keepNext/>
         <w:spacing w:before="200" w:after="60"/>
       </w:pPr>
@@ -10478,6 +10510,7 @@
     </w:p>
     <w:p>
       <w:pPr>
+        <w:pStyle w:val="Heading3"/>
         <w:keepNext/>
         <w:spacing w:before="200" w:after="60"/>
       </w:pPr>
@@ -10697,6 +10730,7 @@
     </w:p>
     <w:p>
       <w:pPr>
+        <w:pStyle w:val="Heading3"/>
         <w:keepNext/>
         <w:spacing w:before="200" w:after="60"/>
       </w:pPr>
@@ -10903,6 +10937,7 @@
     </w:p>
     <w:p>
       <w:pPr>
+        <w:pStyle w:val="Heading2"/>
         <w:keepNext/>
         <w:spacing w:before="280" w:after="100"/>
       </w:pPr>
@@ -11575,6 +11610,7 @@
     </w:p>
     <w:p>
       <w:pPr>
+        <w:pStyle w:val="Heading1"/>
         <w:keepNext/>
         <w:spacing w:before="320" w:after="120"/>
       </w:pPr>
@@ -11650,6 +11686,7 @@
     </w:p>
     <w:p>
       <w:pPr>
+        <w:pStyle w:val="Heading2"/>
         <w:keepNext/>
         <w:spacing w:before="280" w:after="100"/>
       </w:pPr>
@@ -11698,6 +11735,7 @@
     </w:p>
     <w:p>
       <w:pPr>
+        <w:pStyle w:val="Heading3"/>
         <w:keepNext/>
         <w:spacing w:before="200" w:after="60"/>
       </w:pPr>
@@ -12812,6 +12850,7 @@
     </w:p>
     <w:p>
       <w:pPr>
+        <w:pStyle w:val="Heading3"/>
         <w:keepNext/>
         <w:spacing w:before="200" w:after="60"/>
       </w:pPr>
@@ -12878,6 +12917,7 @@
     </w:p>
     <w:p>
       <w:pPr>
+        <w:pStyle w:val="Heading3"/>
         <w:keepNext/>
         <w:spacing w:before="200" w:after="60"/>
       </w:pPr>
@@ -13071,6 +13111,7 @@
     </w:p>
     <w:p>
       <w:pPr>
+        <w:pStyle w:val="Heading3"/>
         <w:keepNext/>
         <w:spacing w:before="200" w:after="60"/>
       </w:pPr>
@@ -13433,6 +13474,7 @@
     </w:p>
     <w:p>
       <w:pPr>
+        <w:pStyle w:val="Heading3"/>
         <w:keepNext/>
         <w:spacing w:before="200" w:after="60"/>
       </w:pPr>
@@ -13447,6 +13489,7 @@
     </w:p>
     <w:p>
       <w:pPr>
+        <w:pStyle w:val="Heading4"/>
         <w:keepNext/>
         <w:spacing w:before="160" w:after="40"/>
       </w:pPr>
@@ -13679,6 +13722,7 @@
     </w:p>
     <w:p>
       <w:pPr>
+        <w:pStyle w:val="Heading4"/>
         <w:keepNext/>
         <w:spacing w:before="160" w:after="40"/>
       </w:pPr>
@@ -13860,6 +13904,7 @@
     </w:p>
     <w:p>
       <w:pPr>
+        <w:pStyle w:val="Heading4"/>
         <w:keepNext/>
         <w:spacing w:before="160" w:after="40"/>
       </w:pPr>
@@ -14209,6 +14254,7 @@
     </w:p>
     <w:p>
       <w:pPr>
+        <w:pStyle w:val="Heading4"/>
         <w:keepNext/>
         <w:spacing w:before="160" w:after="40"/>
       </w:pPr>
@@ -14364,6 +14410,7 @@
     </w:p>
     <w:p>
       <w:pPr>
+        <w:pStyle w:val="Heading3"/>
         <w:keepNext/>
         <w:spacing w:before="200" w:after="60"/>
       </w:pPr>
@@ -14865,6 +14912,7 @@
     </w:p>
     <w:p>
       <w:pPr>
+        <w:pStyle w:val="Heading2"/>
         <w:keepNext/>
         <w:spacing w:before="280" w:after="100"/>
       </w:pPr>
@@ -14905,6 +14953,7 @@
     </w:p>
     <w:p>
       <w:pPr>
+        <w:pStyle w:val="Heading3"/>
         <w:keepNext/>
         <w:spacing w:before="200" w:after="60"/>
       </w:pPr>
@@ -15046,6 +15095,7 @@
     </w:p>
     <w:p>
       <w:pPr>
+        <w:pStyle w:val="Heading3"/>
         <w:keepNext/>
         <w:spacing w:before="200" w:after="60"/>
       </w:pPr>
@@ -15136,6 +15186,7 @@
     </w:p>
     <w:p>
       <w:pPr>
+        <w:pStyle w:val="Heading3"/>
         <w:keepNext/>
         <w:spacing w:before="200" w:after="60"/>
       </w:pPr>
@@ -15150,6 +15201,7 @@
     </w:p>
     <w:p>
       <w:pPr>
+        <w:pStyle w:val="Heading4"/>
         <w:keepNext/>
         <w:spacing w:before="160" w:after="40"/>
       </w:pPr>
@@ -15253,6 +15305,7 @@
     </w:p>
     <w:p>
       <w:pPr>
+        <w:pStyle w:val="Heading4"/>
         <w:keepNext/>
         <w:spacing w:before="160" w:after="40"/>
       </w:pPr>
@@ -15356,6 +15409,7 @@
     </w:p>
     <w:p>
       <w:pPr>
+        <w:pStyle w:val="Heading3"/>
         <w:keepNext/>
         <w:spacing w:before="200" w:after="60"/>
       </w:pPr>
@@ -15532,6 +15586,7 @@
     </w:p>
     <w:p>
       <w:pPr>
+        <w:pStyle w:val="Heading2"/>
         <w:keepNext/>
         <w:spacing w:before="280" w:after="100"/>
       </w:pPr>
@@ -15572,6 +15627,7 @@
     </w:p>
     <w:p>
       <w:pPr>
+        <w:pStyle w:val="Heading3"/>
         <w:keepNext/>
         <w:spacing w:before="200" w:after="60"/>
       </w:pPr>
@@ -16274,6 +16330,7 @@
     </w:p>
     <w:p>
       <w:pPr>
+        <w:pStyle w:val="Heading3"/>
         <w:keepNext/>
         <w:spacing w:before="200" w:after="60"/>
       </w:pPr>
@@ -16479,6 +16536,7 @@
     </w:p>
     <w:p>
       <w:pPr>
+        <w:pStyle w:val="Heading3"/>
         <w:keepNext/>
         <w:spacing w:before="200" w:after="60"/>
       </w:pPr>
@@ -16660,6 +16718,7 @@
     </w:p>
     <w:p>
       <w:pPr>
+        <w:pStyle w:val="Heading3"/>
         <w:keepNext/>
         <w:spacing w:before="200" w:after="60"/>
       </w:pPr>
@@ -16674,6 +16733,7 @@
     </w:p>
     <w:p>
       <w:pPr>
+        <w:pStyle w:val="Heading4"/>
         <w:keepNext/>
         <w:spacing w:before="160" w:after="40"/>
       </w:pPr>
@@ -16803,6 +16863,7 @@
     </w:p>
     <w:p>
       <w:pPr>
+        <w:pStyle w:val="Heading4"/>
         <w:keepNext/>
         <w:spacing w:before="160" w:after="40"/>
       </w:pPr>
@@ -16919,6 +16980,7 @@
     </w:p>
     <w:p>
       <w:pPr>
+        <w:pStyle w:val="Heading4"/>
         <w:keepNext/>
         <w:spacing w:before="160" w:after="40"/>
       </w:pPr>
@@ -17009,6 +17071,7 @@
     </w:p>
     <w:p>
       <w:pPr>
+        <w:pStyle w:val="Heading3"/>
         <w:keepNext/>
         <w:spacing w:before="200" w:after="60"/>
       </w:pPr>
@@ -17338,6 +17401,7 @@
     </w:p>
     <w:p>
       <w:pPr>
+        <w:pStyle w:val="Heading2"/>
         <w:keepNext/>
         <w:spacing w:before="280" w:after="100"/>
       </w:pPr>
@@ -17378,6 +17442,7 @@
     </w:p>
     <w:p>
       <w:pPr>
+        <w:pStyle w:val="Heading3"/>
         <w:keepNext/>
         <w:spacing w:before="200" w:after="60"/>
       </w:pPr>
@@ -17506,6 +17571,7 @@
     </w:p>
     <w:p>
       <w:pPr>
+        <w:pStyle w:val="Heading3"/>
         <w:keepNext/>
         <w:spacing w:before="200" w:after="60"/>
       </w:pPr>
@@ -17596,6 +17662,7 @@
     </w:p>
     <w:p>
       <w:pPr>
+        <w:pStyle w:val="Heading3"/>
         <w:keepNext/>
         <w:spacing w:before="200" w:after="60"/>
       </w:pPr>
@@ -17610,6 +17677,7 @@
     </w:p>
     <w:p>
       <w:pPr>
+        <w:pStyle w:val="Heading4"/>
         <w:keepNext/>
         <w:spacing w:before="160" w:after="40"/>
       </w:pPr>
@@ -17713,6 +17781,7 @@
     </w:p>
     <w:p>
       <w:pPr>
+        <w:pStyle w:val="Heading4"/>
         <w:keepNext/>
         <w:spacing w:before="160" w:after="40"/>
       </w:pPr>
@@ -17803,6 +17872,7 @@
     </w:p>
     <w:p>
       <w:pPr>
+        <w:pStyle w:val="Heading3"/>
         <w:keepNext/>
         <w:spacing w:before="200" w:after="60"/>
       </w:pPr>
@@ -17940,6 +18010,7 @@
     </w:p>
     <w:p>
       <w:pPr>
+        <w:pStyle w:val="Heading2"/>
         <w:keepNext/>
         <w:spacing w:before="280" w:after="100"/>
       </w:pPr>
@@ -17980,6 +18051,7 @@
     </w:p>
     <w:p>
       <w:pPr>
+        <w:pStyle w:val="Heading3"/>
         <w:keepNext/>
         <w:spacing w:before="200" w:after="60"/>
       </w:pPr>
@@ -18458,6 +18530,7 @@
     </w:p>
     <w:p>
       <w:pPr>
+        <w:pStyle w:val="Heading3"/>
         <w:keepNext/>
         <w:spacing w:before="200" w:after="60"/>
       </w:pPr>
@@ -18548,6 +18621,7 @@
     </w:p>
     <w:p>
       <w:pPr>
+        <w:pStyle w:val="Heading3"/>
         <w:keepNext/>
         <w:spacing w:before="200" w:after="60"/>
       </w:pPr>
@@ -18793,6 +18867,7 @@
     </w:p>
     <w:p>
       <w:pPr>
+        <w:pStyle w:val="Heading3"/>
         <w:keepNext/>
         <w:spacing w:before="200" w:after="60"/>
       </w:pPr>
@@ -19008,6 +19083,7 @@
     </w:p>
     <w:p>
       <w:pPr>
+        <w:pStyle w:val="Heading2"/>
         <w:keepNext/>
         <w:spacing w:before="280" w:after="100"/>
       </w:pPr>
@@ -19048,6 +19124,7 @@
     </w:p>
     <w:p>
       <w:pPr>
+        <w:pStyle w:val="Heading3"/>
         <w:keepNext/>
         <w:spacing w:before="200" w:after="60"/>
       </w:pPr>
@@ -19176,6 +19253,7 @@
     </w:p>
     <w:p>
       <w:pPr>
+        <w:pStyle w:val="Heading3"/>
         <w:keepNext/>
         <w:spacing w:before="200" w:after="60"/>
       </w:pPr>
@@ -19292,6 +19370,7 @@
     </w:p>
     <w:p>
       <w:pPr>
+        <w:pStyle w:val="Heading3"/>
         <w:keepNext/>
         <w:spacing w:before="200" w:after="60"/>
       </w:pPr>
@@ -19306,6 +19385,7 @@
     </w:p>
     <w:p>
       <w:pPr>
+        <w:pStyle w:val="Heading4"/>
         <w:keepNext/>
         <w:spacing w:before="160" w:after="40"/>
       </w:pPr>
@@ -19422,6 +19502,7 @@
     </w:p>
     <w:p>
       <w:pPr>
+        <w:pStyle w:val="Heading4"/>
         <w:keepNext/>
         <w:spacing w:before="160" w:after="40"/>
       </w:pPr>
@@ -19616,6 +19697,7 @@
     </w:p>
     <w:p>
       <w:pPr>
+        <w:pStyle w:val="Heading3"/>
         <w:keepNext/>
         <w:spacing w:before="200" w:after="60"/>
       </w:pPr>
@@ -19766,6 +19848,7 @@
     </w:p>
     <w:p>
       <w:pPr>
+        <w:pStyle w:val="Heading2"/>
         <w:keepNext/>
         <w:spacing w:before="280" w:after="100"/>
       </w:pPr>
@@ -19806,6 +19889,7 @@
     </w:p>
     <w:p>
       <w:pPr>
+        <w:pStyle w:val="Heading3"/>
         <w:keepNext/>
         <w:spacing w:before="200" w:after="60"/>
       </w:pPr>
@@ -20286,6 +20370,7 @@
     </w:p>
     <w:p>
       <w:pPr>
+        <w:pStyle w:val="Heading3"/>
         <w:keepNext/>
         <w:spacing w:before="200" w:after="60"/>
       </w:pPr>
@@ -20454,6 +20539,7 @@
     </w:p>
     <w:p>
       <w:pPr>
+        <w:pStyle w:val="Heading3"/>
         <w:keepNext/>
         <w:spacing w:before="200" w:after="60"/>
       </w:pPr>
@@ -20468,6 +20554,7 @@
     </w:p>
     <w:p>
       <w:pPr>
+        <w:pStyle w:val="Heading4"/>
         <w:keepNext/>
         <w:spacing w:before="160" w:after="40"/>
       </w:pPr>
@@ -20584,6 +20671,7 @@
     </w:p>
     <w:p>
       <w:pPr>
+        <w:pStyle w:val="Heading4"/>
         <w:keepNext/>
         <w:spacing w:before="160" w:after="40"/>
       </w:pPr>
@@ -20700,6 +20788,7 @@
     </w:p>
     <w:p>
       <w:pPr>
+        <w:pStyle w:val="Heading4"/>
         <w:keepNext/>
         <w:spacing w:before="160" w:after="40"/>
       </w:pPr>
@@ -20893,6 +20982,7 @@
     </w:p>
     <w:p>
       <w:pPr>
+        <w:pStyle w:val="Heading3"/>
         <w:keepNext/>
         <w:spacing w:before="200" w:after="60"/>
       </w:pPr>
@@ -21159,6 +21249,7 @@
     </w:p>
     <w:p>
       <w:pPr>
+        <w:pStyle w:val="Heading2"/>
         <w:keepNext/>
         <w:spacing w:before="280" w:after="100"/>
       </w:pPr>
@@ -21251,6 +21342,7 @@
     </w:p>
     <w:p>
       <w:pPr>
+        <w:pStyle w:val="Heading3"/>
         <w:keepNext/>
         <w:spacing w:before="200" w:after="60"/>
       </w:pPr>
@@ -21991,6 +22083,7 @@
     </w:p>
     <w:p>
       <w:pPr>
+        <w:pStyle w:val="Heading3"/>
         <w:keepNext/>
         <w:spacing w:before="200" w:after="60"/>
       </w:pPr>
@@ -22835,6 +22928,7 @@
     </w:p>
     <w:p>
       <w:pPr>
+        <w:pStyle w:val="Heading3"/>
         <w:keepNext/>
         <w:spacing w:before="200" w:after="60"/>
       </w:pPr>
@@ -22849,6 +22943,7 @@
     </w:p>
     <w:p>
       <w:pPr>
+        <w:pStyle w:val="Heading4"/>
         <w:keepNext/>
         <w:spacing w:before="160" w:after="40"/>
       </w:pPr>
@@ -22952,6 +23047,7 @@
     </w:p>
     <w:p>
       <w:pPr>
+        <w:pStyle w:val="Heading4"/>
         <w:keepNext/>
         <w:spacing w:before="160" w:after="40"/>
       </w:pPr>
@@ -23146,6 +23242,7 @@
     </w:p>
     <w:p>
       <w:pPr>
+        <w:pStyle w:val="Heading4"/>
         <w:keepNext/>
         <w:spacing w:before="160" w:after="40"/>
       </w:pPr>
@@ -23300,6 +23397,7 @@
     </w:p>
     <w:p>
       <w:pPr>
+        <w:pStyle w:val="Heading3"/>
         <w:keepNext/>
         <w:spacing w:before="200" w:after="60"/>
       </w:pPr>
@@ -23808,6 +23906,7 @@
     </w:p>
     <w:p>
       <w:pPr>
+        <w:pStyle w:val="Heading1"/>
         <w:keepNext/>
         <w:spacing w:before="320" w:after="120"/>
       </w:pPr>
@@ -23822,6 +23921,7 @@
     </w:p>
     <w:p>
       <w:pPr>
+        <w:pStyle w:val="Heading2"/>
         <w:keepNext/>
         <w:spacing w:before="280" w:after="100"/>
       </w:pPr>
@@ -25392,6 +25492,7 @@
     </w:p>
     <w:p>
       <w:pPr>
+        <w:pStyle w:val="Heading2"/>
         <w:keepNext/>
         <w:spacing w:before="280" w:after="100"/>
       </w:pPr>
@@ -26305,6 +26406,7 @@
     </w:p>
     <w:p>
       <w:pPr>
+        <w:pStyle w:val="Heading2"/>
         <w:keepNext/>
         <w:spacing w:before="280" w:after="100"/>
       </w:pPr>
@@ -27218,6 +27320,7 @@
     </w:p>
     <w:p>
       <w:pPr>
+        <w:pStyle w:val="Heading2"/>
         <w:keepNext/>
         <w:spacing w:before="280" w:after="100"/>
       </w:pPr>
@@ -27555,6 +27658,7 @@
     </w:p>
     <w:p>
       <w:pPr>
+        <w:pStyle w:val="Heading2"/>
         <w:keepNext/>
         <w:spacing w:before="280" w:after="100"/>
       </w:pPr>
@@ -27892,6 +27996,7 @@
     </w:p>
     <w:p>
       <w:pPr>
+        <w:pStyle w:val="Heading2"/>
         <w:keepNext/>
         <w:spacing w:before="280" w:after="100"/>
       </w:pPr>

</xml_diff>